<commit_message>
did some stuff lol
</commit_message>
<xml_diff>
--- a/Component Choices.docx
+++ b/Component Choices.docx
@@ -1,9 +1,25 @@
 
 <file path=word/document.xml><?xml version="1.0" encoding="utf-8"?>
-<w:document xmlns:wpc="http://schemas.microsoft.com/office/word/2010/wordprocessingCanvas" xmlns:cx="http://schemas.microsoft.com/office/drawing/2014/chartex" xmlns:cx1="http://schemas.microsoft.com/office/drawing/2015/9/8/chartex" xmlns:cx2="http://schemas.microsoft.com/office/drawing/2015/10/21/chartex" xmlns:cx3="http://schemas.microsoft.com/office/drawing/2016/5/9/chartex" xmlns:cx4="http://schemas.microsoft.com/office/drawing/2016/5/10/chartex" xmlns:cx5="http://schemas.microsoft.com/office/drawing/2016/5/11/chartex" xmlns:cx6="http://schemas.microsoft.com/office/drawing/2016/5/12/chartex" xmlns:cx7="http://schemas.microsoft.com/office/drawing/2016/5/13/chartex" xmlns:cx8="http://schemas.microsoft.com/office/drawing/2016/5/14/chartex" xmlns:mc="http://schemas.openxmlformats.org/markup-compatibility/2006" xmlns:m="http://schemas.openxmlformats.org/officeDocument/2006/math" xmlns:aink="http://schemas.microsoft.com/office/drawing/2016/ink" xmlns:am3d="http://schemas.microsoft.com/office/drawing/2017/model3d" xmlns:oel="http://schemas.microsoft.com/office/2019/extlst" xmlns:r="http://schemas.openxmlformats.org/officeDocument/2006/relationships" xmlns:wp14="http://schemas.microsoft.com/office/word/2010/wordprocessingDrawing" xmlns:wp="http://schemas.openxmlformats.org/drawingml/2006/wordprocessingDrawing" xmlns:wpg="http://schemas.microsoft.com/office/word/2010/wordprocessingGroup" xmlns:wpi="http://schemas.microsoft.com/office/word/2010/wordprocessingInk" xmlns:wps="http://schemas.microsoft.com/office/word/2010/wordprocessingShape" xmlns:o="urn:schemas-microsoft-com:office:office" xmlns:v="urn:schemas-microsoft-com:vml" xmlns:w10="urn:schemas-microsoft-com:office:word" xmlns:w="http://schemas.openxmlformats.org/wordprocessingml/2006/main" xmlns:w14="http://schemas.microsoft.com/office/word/2010/wordml" xmlns:w15="http://schemas.microsoft.com/office/word/2012/wordml" xmlns:w16cex="http://schemas.microsoft.com/office/word/2018/wordml/cex" xmlns:w16cid="http://schemas.microsoft.com/office/word/2016/wordml/cid" xmlns:w16="http://schemas.microsoft.com/office/word/2018/wordml" xmlns:w16sdtdh="http://schemas.microsoft.com/office/word/2020/wordml/sdtdatahash" xmlns:w16sdtfl="http://schemas.microsoft.com/office/word/2024/wordml/sdtformatlock" xmlns:w16se="http://schemas.microsoft.com/office/word/2015/wordml/symex" xmlns:w16du="http://schemas.microsoft.com/office/word/2023/wordml/word16du" xmlns:wne="http://schemas.microsoft.com/office/word/2006/wordml" mc:Ignorable="w14 w15 w16se w16cid w16 w16cex w16sdtdh w16sdtfl w16du wp14">
+<w:document xmlns:wpc="http://schemas.microsoft.com/office/word/2010/wordprocessingCanvas" xmlns:cx="http://schemas.microsoft.com/office/drawing/2014/chartex" xmlns:cx1="http://schemas.microsoft.com/office/drawing/2015/9/8/chartex" xmlns:cx2="http://schemas.microsoft.com/office/drawing/2015/10/21/chartex" xmlns:cx3="http://schemas.microsoft.com/office/drawing/2016/5/9/chartex" xmlns:cx4="http://schemas.microsoft.com/office/drawing/2016/5/10/chartex" xmlns:cx5="http://schemas.microsoft.com/office/drawing/2016/5/11/chartex" xmlns:cx6="http://schemas.microsoft.com/office/drawing/2016/5/12/chartex" xmlns:cx7="http://schemas.microsoft.com/office/drawing/2016/5/13/chartex" xmlns:cx8="http://schemas.microsoft.com/office/drawing/2016/5/14/chartex" xmlns:mc="http://schemas.openxmlformats.org/markup-compatibility/2006" xmlns:m="http://schemas.openxmlformats.org/officeDocument/2006/math" xmlns:aink="http://schemas.microsoft.com/office/drawing/2016/ink" xmlns:am3d="http://schemas.microsoft.com/office/drawing/2017/model3d" xmlns:oel="http://schemas.microsoft.com/office/2019/extlst" xmlns:r="http://schemas.openxmlformats.org/officeDocument/2006/relationships" xmlns:wp14="http://schemas.microsoft.com/office/word/2010/wordprocessingDrawing" xmlns:wp="http://schemas.openxmlformats.org/drawingml/2006/wordprocessingDrawing" xmlns:wpg="http://schemas.microsoft.com/office/word/2010/wordprocessingGroup" xmlns:wpi="http://schemas.microsoft.com/office/word/2010/wordprocessingInk" xmlns:wps="http://schemas.microsoft.com/office/word/2010/wordprocessingShape" xmlns:o="urn:schemas-microsoft-com:office:office" xmlns:v="urn:schemas-microsoft-com:vml" xmlns:w10="urn:schemas-microsoft-com:office:word" xmlns:w="http://schemas.openxmlformats.org/wordprocessingml/2006/main" xmlns:w14="http://schemas.microsoft.com/office/word/2010/wordml" xmlns:w15="http://schemas.microsoft.com/office/word/2012/wordml" xmlns:w16cei="http://schemas.microsoft.com/office/word/2026/wordml/cei" xmlns:w16cex="http://schemas.microsoft.com/office/word/2018/wordml/cex" xmlns:w16cid="http://schemas.microsoft.com/office/word/2016/wordml/cid" xmlns:w16="http://schemas.microsoft.com/office/word/2018/wordml" xmlns:w16sdtdh="http://schemas.microsoft.com/office/word/2020/wordml/sdtdatahash" xmlns:w16sdtfl="http://schemas.microsoft.com/office/word/2024/wordml/sdtformatlock" xmlns:w16se="http://schemas.microsoft.com/office/word/2015/wordml/symex" xmlns:w16du="http://schemas.microsoft.com/office/word/2023/wordml/word16du" xmlns:wne="http://schemas.microsoft.com/office/word/2006/wordml" mc:Ignorable="w14 w15 w16se w16cid w16 w16cex w16sdtdh w16sdtfl w16du wp14">
   <w:body>
     <w:p>
-      <w:r>
+      <w:pPr>
+        <w:rPr>
+          <w:b/>
+          <w:bCs/>
+          <w:i/>
+          <w:iCs/>
+          <w:u w:val="single"/>
+        </w:rPr>
+      </w:pPr>
+      <w:r>
+        <w:rPr>
+          <w:b/>
+          <w:bCs/>
+          <w:i/>
+          <w:iCs/>
+          <w:u w:val="single"/>
+        </w:rPr>
         <w:t>DIGITAL</w:t>
       </w:r>
     </w:p>
@@ -13,208 +29,372 @@
       </w:r>
       <w:bookmarkStart w:id="0" w:name="_Hlk234623726"/>
       <w:r>
+        <w:rPr>
+          <w:b/>
+          <w:bCs/>
+        </w:rPr>
         <w:t>STM32G474</w:t>
       </w:r>
       <w:bookmarkEnd w:id="0"/>
     </w:p>
     <w:p>
+      <w:r>
+        <w:t xml:space="preserve">GPIO </w:t>
+      </w:r>
+      <w:r>
+        <w:t>Expander</w:t>
+      </w:r>
+      <w:r>
+        <w:t xml:space="preserve"> I2C – </w:t>
+      </w:r>
+      <w:r>
+        <w:rPr>
+          <w:b/>
+          <w:bCs/>
+        </w:rPr>
+        <w:t>MCP23S17</w:t>
+      </w:r>
+    </w:p>
+    <w:p>
+      <w:r>
+        <w:t>CV</w:t>
+      </w:r>
+      <w:r>
+        <w:t xml:space="preserve"> </w:t>
+      </w:r>
+      <w:r>
+        <w:t xml:space="preserve">DAC – </w:t>
+      </w:r>
+      <w:r>
+        <w:rPr>
+          <w:b/>
+          <w:bCs/>
+        </w:rPr>
+        <w:t>DAC80508M</w:t>
+      </w:r>
+    </w:p>
+    <w:p>
+      <w:r>
+        <w:t xml:space="preserve">CV DAC </w:t>
+      </w:r>
+      <w:r>
+        <w:t>Low</w:t>
+      </w:r>
+      <w:r>
+        <w:t xml:space="preserve"> </w:t>
+      </w:r>
+      <w:r>
+        <w:t>Quality</w:t>
+      </w:r>
+      <w:r>
+        <w:t xml:space="preserve"> - </w:t>
+      </w:r>
+      <w:r>
+        <w:rPr>
+          <w:b/>
+          <w:bCs/>
+        </w:rPr>
+        <w:t>D088S085CI</w:t>
+      </w:r>
+    </w:p>
+    <w:p>
+      <w:pPr>
+        <w:rPr>
+          <w:b/>
+          <w:bCs/>
+        </w:rPr>
+      </w:pPr>
+      <w:r>
+        <w:t xml:space="preserve">Op Amp </w:t>
+      </w:r>
+      <w:r>
+        <w:t>for CVs</w:t>
+      </w:r>
+      <w:r>
+        <w:t xml:space="preserve">- </w:t>
+      </w:r>
+      <w:r>
+        <w:rPr>
+          <w:b/>
+          <w:bCs/>
+        </w:rPr>
+        <w:t>LM324A</w:t>
+      </w:r>
+    </w:p>
+    <w:p>
+      <w:pPr>
+        <w:rPr>
+          <w:b/>
+          <w:bCs/>
+        </w:rPr>
+      </w:pPr>
+      <w:r>
+        <w:t xml:space="preserve">Logic level shifter - </w:t>
+      </w:r>
+      <w:r>
+        <w:rPr>
+          <w:b/>
+          <w:bCs/>
+        </w:rPr>
+        <w:t>SN74LVC245</w:t>
+      </w:r>
+    </w:p>
+    <w:p/>
+    <w:p>
+      <w:pPr>
+        <w:rPr>
+          <w:b/>
+          <w:bCs/>
+          <w:i/>
+          <w:iCs/>
+          <w:u w:val="single"/>
+        </w:rPr>
+      </w:pPr>
+      <w:r>
+        <w:rPr>
+          <w:b/>
+          <w:bCs/>
+          <w:i/>
+          <w:iCs/>
+          <w:u w:val="single"/>
+        </w:rPr>
+        <w:t>PHYSICAL</w:t>
+      </w:r>
+    </w:p>
+    <w:p>
+      <w:r>
+        <w:t>Fader – Alps RSA0N Slide 100mm Motorized, Touch sensitive (Clones)</w:t>
+      </w:r>
+    </w:p>
+    <w:p>
+      <w:r>
+        <w:t xml:space="preserve">PWM motor driver - </w:t>
+      </w:r>
+      <w:r>
+        <w:rPr>
+          <w:b/>
+          <w:bCs/>
+        </w:rPr>
+        <w:t>L293D</w:t>
+      </w:r>
+    </w:p>
+    <w:p>
+      <w:r>
+        <w:t xml:space="preserve">Touch sensor – </w:t>
+      </w:r>
+      <w:r>
+        <w:rPr>
+          <w:b/>
+          <w:bCs/>
+        </w:rPr>
+        <w:t>TTP223-BA6</w:t>
+      </w:r>
+    </w:p>
+    <w:p>
+      <w:r>
+        <w:t>Rotary Encoder – EC11 with switch (press knob)</w:t>
+      </w:r>
+      <w:r>
+        <w:t xml:space="preserve">, cap = </w:t>
+      </w:r>
       <w:proofErr w:type="spellStart"/>
       <w:r>
-        <w:t>Addtl</w:t>
+        <w:t>sifam</w:t>
       </w:r>
       <w:proofErr w:type="spellEnd"/>
       <w:r>
+        <w:t xml:space="preserve"> 11.5mm</w:t>
+      </w:r>
+    </w:p>
+    <w:p>
+      <w:r>
+        <w:t xml:space="preserve">LED Shift Register - </w:t>
+      </w:r>
+      <w:r>
+        <w:rPr>
+          <w:b/>
+          <w:bCs/>
+        </w:rPr>
+        <w:t>74HC</w:t>
+      </w:r>
+      <w:r>
+        <w:rPr>
+          <w:b/>
+          <w:bCs/>
+        </w:rPr>
+        <w:t>T</w:t>
+      </w:r>
+      <w:r>
+        <w:rPr>
+          <w:b/>
+          <w:bCs/>
+        </w:rPr>
+        <w:t>595</w:t>
+      </w:r>
+      <w:r>
         <w:t xml:space="preserve"> </w:t>
       </w:r>
       <w:r>
-        <w:t xml:space="preserve">ADC - </w:t>
-      </w:r>
-      <w:bookmarkStart w:id="1" w:name="_Hlk234623692"/>
-      <w:r>
-        <w:t>ADS1115</w:t>
+        <w:t xml:space="preserve">(4x per </w:t>
+      </w:r>
+      <w:r>
+        <w:t>knob</w:t>
+      </w:r>
+      <w:r>
+        <w:t>)</w:t>
+      </w:r>
+    </w:p>
+    <w:p>
+      <w:r>
+        <w:t xml:space="preserve">Button </w:t>
+      </w:r>
+      <w:r>
+        <w:t xml:space="preserve">(With led) </w:t>
+      </w:r>
+      <w:r>
+        <w:t>–</w:t>
+      </w:r>
+      <w:r>
+        <w:t xml:space="preserve"> </w:t>
+      </w:r>
+      <w:r>
+        <w:rPr>
+          <w:b/>
+          <w:bCs/>
+        </w:rPr>
+        <w:t>563-2300-ND</w:t>
+      </w:r>
+      <w:r>
+        <w:rPr>
+          <w:b/>
+          <w:bCs/>
+        </w:rPr>
+        <w:t>??</w:t>
+      </w:r>
+    </w:p>
+    <w:p/>
+    <w:p>
+      <w:pPr>
+        <w:rPr>
+          <w:b/>
+          <w:bCs/>
+          <w:i/>
+          <w:iCs/>
+          <w:u w:val="single"/>
+        </w:rPr>
+      </w:pPr>
+      <w:r>
+        <w:rPr>
+          <w:b/>
+          <w:bCs/>
+          <w:i/>
+          <w:iCs/>
+          <w:u w:val="single"/>
+        </w:rPr>
+        <w:t>ANALOG</w:t>
+      </w:r>
+    </w:p>
+    <w:p>
+      <w:r>
+        <w:t xml:space="preserve">Op Amp – </w:t>
+      </w:r>
+      <w:r>
+        <w:rPr>
+          <w:b/>
+          <w:bCs/>
+        </w:rPr>
+        <w:t>NE5532</w:t>
+      </w:r>
+    </w:p>
+    <w:p>
+      <w:r>
+        <w:t>Op Amp (</w:t>
+      </w:r>
+      <w:proofErr w:type="spellStart"/>
+      <w:r>
+        <w:t>Hifi</w:t>
+      </w:r>
+      <w:proofErr w:type="spellEnd"/>
+      <w:r>
+        <w:t xml:space="preserve">) – </w:t>
+      </w:r>
+      <w:r>
+        <w:rPr>
+          <w:b/>
+          <w:bCs/>
+        </w:rPr>
+        <w:t>OPA 2134</w:t>
+      </w:r>
+    </w:p>
+    <w:p>
+      <w:r>
+        <w:t xml:space="preserve">Line In – </w:t>
+      </w:r>
+      <w:r>
+        <w:rPr>
+          <w:b/>
+          <w:bCs/>
+        </w:rPr>
+        <w:t>INA 2137</w:t>
+      </w:r>
+    </w:p>
+    <w:p>
+      <w:r>
+        <w:t xml:space="preserve">OTA – </w:t>
+      </w:r>
+      <w:r>
+        <w:rPr>
+          <w:b/>
+          <w:bCs/>
+        </w:rPr>
+        <w:t>LM13700</w:t>
+      </w:r>
+    </w:p>
+    <w:p>
+      <w:r>
+        <w:t xml:space="preserve">VCA – </w:t>
+      </w:r>
+      <w:r>
+        <w:rPr>
+          <w:b/>
+          <w:bCs/>
+        </w:rPr>
+        <w:t>THAT 2180</w:t>
+      </w:r>
+      <w:r>
+        <w:rPr>
+          <w:b/>
+          <w:bCs/>
+        </w:rPr>
+        <w:t>B</w:t>
+      </w:r>
+    </w:p>
+    <w:p>
+      <w:r>
+        <w:t xml:space="preserve">Signal Switch - </w:t>
+      </w:r>
+      <w:bookmarkStart w:id="1" w:name="_Hlk234623901"/>
+      <w:r>
+        <w:rPr>
+          <w:b/>
+          <w:bCs/>
+        </w:rPr>
+        <w:t>ADG1404</w:t>
       </w:r>
       <w:bookmarkEnd w:id="1"/>
     </w:p>
     <w:p>
-      <w:proofErr w:type="spellStart"/>
-      <w:r>
-        <w:t>Addtl</w:t>
-      </w:r>
-      <w:proofErr w:type="spellEnd"/>
-      <w:r>
-        <w:t xml:space="preserve"> </w:t>
-      </w:r>
-      <w:r>
-        <w:t>DAC – DAC80508M</w:t>
-      </w:r>
-    </w:p>
-    <w:p>
-      <w:proofErr w:type="gramStart"/>
-      <w:r>
-        <w:t>?Use</w:t>
-      </w:r>
-      <w:proofErr w:type="gramEnd"/>
-      <w:r>
-        <w:t xml:space="preserve">? </w:t>
-      </w:r>
-      <w:proofErr w:type="gramStart"/>
-      <w:r>
-        <w:t>I</w:t>
-      </w:r>
-      <w:proofErr w:type="gramEnd"/>
-      <w:r>
-        <w:t xml:space="preserve">2C Multiplexer - </w:t>
-      </w:r>
-      <w:bookmarkStart w:id="2" w:name="_Hlk234623763"/>
-      <w:r>
-        <w:t>TCA9548A</w:t>
-      </w:r>
-      <w:bookmarkEnd w:id="2"/>
-    </w:p>
-    <w:p>
-      <w:r>
-        <w:t>Op Amp Control Sigs - TL074</w:t>
-      </w:r>
-    </w:p>
-    <w:p/>
-    <w:p/>
-    <w:p>
-      <w:r>
-        <w:t>PHYSICAL</w:t>
-      </w:r>
-    </w:p>
-    <w:p>
-      <w:r>
-        <w:t>Fader – Alps RSA0N Slide 100mm Motorized, Touch sensitive (Clones)</w:t>
-      </w:r>
-    </w:p>
-    <w:p>
-      <w:r>
-        <w:t>Rotary Encoder – EC11 with switch (press knob)</w:t>
-      </w:r>
-      <w:r>
-        <w:t xml:space="preserve">, cap = </w:t>
-      </w:r>
-      <w:proofErr w:type="spellStart"/>
-      <w:r>
-        <w:t>sifam</w:t>
-      </w:r>
-      <w:proofErr w:type="spellEnd"/>
-      <w:r>
-        <w:t xml:space="preserve"> 11.5mm</w:t>
-      </w:r>
-    </w:p>
-    <w:p>
-      <w:r>
-        <w:t xml:space="preserve">LED Shift Register - </w:t>
-      </w:r>
-      <w:r>
-        <w:t>74HC</w:t>
-      </w:r>
-      <w:r>
-        <w:t>T</w:t>
-      </w:r>
-      <w:r>
-        <w:t xml:space="preserve">595 </w:t>
-      </w:r>
-      <w:r>
-        <w:t xml:space="preserve">(4x per </w:t>
-      </w:r>
-      <w:r>
-        <w:t>knob</w:t>
-      </w:r>
-      <w:r>
-        <w:t>)</w:t>
-      </w:r>
-    </w:p>
-    <w:p>
-      <w:r>
-        <w:t xml:space="preserve">Button </w:t>
-      </w:r>
-      <w:r>
-        <w:t>–</w:t>
-      </w:r>
-      <w:r>
-        <w:t xml:space="preserve"> </w:t>
-      </w:r>
-    </w:p>
-    <w:p>
-      <w:r>
-        <w:t xml:space="preserve">Laser Cutter – </w:t>
-      </w:r>
-      <w:proofErr w:type="spellStart"/>
-      <w:r>
-        <w:t>xTool</w:t>
-      </w:r>
-      <w:proofErr w:type="spellEnd"/>
-      <w:r>
-        <w:t xml:space="preserve"> M2</w:t>
-      </w:r>
-    </w:p>
-    <w:p/>
-    <w:p/>
-    <w:p/>
-    <w:p>
-      <w:r>
-        <w:t>ANALOG</w:t>
-      </w:r>
-    </w:p>
-    <w:p>
-      <w:r>
-        <w:t>Op Amp – NE5532</w:t>
-      </w:r>
-    </w:p>
-    <w:p>
-      <w:r>
-        <w:t>Op Amp (</w:t>
-      </w:r>
-      <w:proofErr w:type="spellStart"/>
-      <w:r>
-        <w:t>Hifi</w:t>
-      </w:r>
-      <w:proofErr w:type="spellEnd"/>
-      <w:r>
-        <w:t xml:space="preserve">) – </w:t>
-      </w:r>
-      <w:r>
-        <w:t>OPA 2134</w:t>
-      </w:r>
-    </w:p>
-    <w:p>
-      <w:r>
-        <w:t>Line In – INA 2137</w:t>
-      </w:r>
-    </w:p>
-    <w:p>
-      <w:r>
-        <w:t>OTA – LM13700</w:t>
-      </w:r>
-    </w:p>
-    <w:p>
-      <w:r>
-        <w:t>VCA – THAT 2180</w:t>
-      </w:r>
-      <w:r>
-        <w:t>B</w:t>
-      </w:r>
-    </w:p>
-    <w:p>
-      <w:r>
-        <w:t xml:space="preserve">Signal Switch - </w:t>
-      </w:r>
-      <w:bookmarkStart w:id="3" w:name="_Hlk234623901"/>
-      <w:r>
-        <w:t>ADG1404</w:t>
-      </w:r>
-      <w:bookmarkEnd w:id="3"/>
-    </w:p>
-    <w:p>
-      <w:r>
-        <w:t>VU Meter – LM3916</w:t>
-      </w:r>
-    </w:p>
-    <w:p/>
-    <w:p/>
+      <w:r>
+        <w:t xml:space="preserve">VU Meter – </w:t>
+      </w:r>
+      <w:r>
+        <w:rPr>
+          <w:b/>
+          <w:bCs/>
+        </w:rPr>
+        <w:t>LM3916</w:t>
+      </w:r>
+    </w:p>
     <w:p/>
     <w:p/>
     <w:sectPr>
@@ -655,7 +835,6 @@
     <w:next w:val="Normal"/>
     <w:link w:val="Heading2Char"/>
     <w:uiPriority w:val="9"/>
-    <w:semiHidden/>
     <w:unhideWhenUsed/>
     <w:qFormat/>
     <w:rsid w:val="00866C0B"/>
@@ -872,7 +1051,6 @@
     <w:basedOn w:val="DefaultParagraphFont"/>
     <w:link w:val="Heading2"/>
     <w:uiPriority w:val="9"/>
-    <w:semiHidden/>
     <w:rsid w:val="00866C0B"/>
     <w:rPr>
       <w:rFonts w:asciiTheme="majorHAnsi" w:eastAsiaTheme="majorEastAsia" w:hAnsiTheme="majorHAnsi" w:cstheme="majorBidi"/>

</xml_diff>